<commit_message>
Add Connexon mark, brand guide and social preview
</commit_message>
<xml_diff>
--- a/README.docx
+++ b/README.docx
@@ -2,7 +2,62 @@
 <file path=word/document.xml><?xml version="1.0" encoding="utf-8"?>
 <w:document xmlns:w="http://schemas.openxmlformats.org/wordprocessingml/2006/main" xmlns:m="http://schemas.openxmlformats.org/officeDocument/2006/math" xmlns:r="http://schemas.openxmlformats.org/officeDocument/2006/relationships" xmlns:o="urn:schemas-microsoft-com:office:office" xmlns:v="urn:schemas-microsoft-com:vml" xmlns:w10="urn:schemas-microsoft-com:office:word" xmlns:a="http://schemas.openxmlformats.org/drawingml/2006/main" xmlns:pic="http://schemas.openxmlformats.org/drawingml/2006/picture" xmlns:wp="http://schemas.openxmlformats.org/drawingml/2006/wordprocessingDrawing">
   <w:body>
-    <w:bookmarkStart w:id="43" w:name="connexon"/>
+    <w:p>
+      <w:pPr>
+        <w:pStyle w:val="CaptionedFigure"/>
+      </w:pPr>
+      <w:r>
+        <w:drawing>
+          <wp:inline>
+            <wp:extent cx="1625600" cy="1625600"/>
+            <wp:effectExtent b="0" l="0" r="0" t="0"/>
+            <wp:docPr descr="Connexon logo" title="" id="10" name="Picture"/>
+            <a:graphic>
+              <a:graphicData uri="http://schemas.openxmlformats.org/drawingml/2006/picture">
+                <pic:pic>
+                  <pic:nvPicPr>
+                    <pic:cNvPr descr="assets/logo-128.png" id="11" name="Picture"/>
+                    <pic:cNvPicPr>
+                      <a:picLocks noChangeArrowheads="1" noChangeAspect="1"/>
+                    </pic:cNvPicPr>
+                  </pic:nvPicPr>
+                  <pic:blipFill>
+                    <a:blip r:embed="rId9"/>
+                    <a:stretch>
+                      <a:fillRect/>
+                    </a:stretch>
+                  </pic:blipFill>
+                  <pic:spPr bwMode="auto">
+                    <a:xfrm>
+                      <a:off x="0" y="0"/>
+                      <a:ext cx="1625600" cy="1625600"/>
+                    </a:xfrm>
+                    <a:prstGeom prst="rect">
+                      <a:avLst/>
+                    </a:prstGeom>
+                    <a:noFill/>
+                    <a:ln w="9525">
+                      <a:noFill/>
+                      <a:headEnd/>
+                      <a:tailEnd/>
+                    </a:ln>
+                  </pic:spPr>
+                </pic:pic>
+              </a:graphicData>
+            </a:graphic>
+          </wp:inline>
+        </w:drawing>
+      </w:r>
+    </w:p>
+    <w:p>
+      <w:pPr>
+        <w:pStyle w:val="ImageCaption"/>
+      </w:pPr>
+      <w:r>
+        <w:t xml:space="preserve">Connexon logo</w:t>
+      </w:r>
+    </w:p>
+    <w:bookmarkStart w:id="47" w:name="connexon"/>
     <w:p>
       <w:pPr>
         <w:pStyle w:val="Heading1"/>
@@ -139,7 +194,7 @@
         </w:pict>
       </w:r>
     </w:p>
-    <w:bookmarkStart w:id="9" w:name="why-connexon"/>
+    <w:bookmarkStart w:id="12" w:name="why-connexon"/>
     <w:p>
       <w:pPr>
         <w:pStyle w:val="Heading2"/>
@@ -458,8 +513,8 @@
         </w:pict>
       </w:r>
     </w:p>
-    <w:bookmarkEnd w:id="9"/>
-    <w:bookmarkStart w:id="11" w:name="status"/>
+    <w:bookmarkEnd w:id="12"/>
+    <w:bookmarkStart w:id="14" w:name="status"/>
     <w:p>
       <w:pPr>
         <w:pStyle w:val="Heading2"/>
@@ -871,7 +926,7 @@
       <w:r>
         <w:t xml:space="preserve"> </w:t>
       </w:r>
-      <w:hyperlink r:id="rId10">
+      <w:hyperlink r:id="rId13">
         <w:r>
           <w:rPr>
             <w:rStyle w:val="VerbatimChar"/>
@@ -893,8 +948,8 @@
         </w:pict>
       </w:r>
     </w:p>
-    <w:bookmarkEnd w:id="11"/>
-    <w:bookmarkStart w:id="16" w:name="quick-start"/>
+    <w:bookmarkEnd w:id="14"/>
+    <w:bookmarkStart w:id="19" w:name="quick-start"/>
     <w:p>
       <w:pPr>
         <w:pStyle w:val="Heading2"/>
@@ -903,7 +958,7 @@
         <w:t xml:space="preserve">Quick start</w:t>
       </w:r>
     </w:p>
-    <w:bookmarkStart w:id="12" w:name="prerequisites"/>
+    <w:bookmarkStart w:id="15" w:name="prerequisites"/>
     <w:p>
       <w:pPr>
         <w:pStyle w:val="Heading3"/>
@@ -1190,8 +1245,8 @@
         <w:t xml:space="preserve">calls. The test suite skips bridge tests when an interpreter is absent.</w:t>
       </w:r>
     </w:p>
-    <w:bookmarkEnd w:id="12"/>
-    <w:bookmarkStart w:id="13" w:name="build-and-run"/>
+    <w:bookmarkEnd w:id="15"/>
+    <w:bookmarkStart w:id="16" w:name="build-and-run"/>
     <w:p>
       <w:pPr>
         <w:pStyle w:val="Heading3"/>
@@ -1521,8 +1576,8 @@
         <w:t xml:space="preserve">1.5811388300841898</w:t>
       </w:r>
     </w:p>
-    <w:bookmarkEnd w:id="13"/>
-    <w:bookmarkStart w:id="14" w:name="install-the-cnx-binary"/>
+    <w:bookmarkEnd w:id="16"/>
+    <w:bookmarkStart w:id="17" w:name="install-the-cnx-binary"/>
     <w:p>
       <w:pPr>
         <w:pStyle w:val="Heading3"/>
@@ -1629,8 +1684,8 @@
         <w:t xml:space="preserve"># 2.5</w:t>
       </w:r>
     </w:p>
-    <w:bookmarkEnd w:id="14"/>
-    <w:bookmarkStart w:id="15" w:name="or-use-the-makefile"/>
+    <w:bookmarkEnd w:id="17"/>
+    <w:bookmarkStart w:id="18" w:name="or-use-the-makefile"/>
     <w:p>
       <w:pPr>
         <w:pStyle w:val="Heading3"/>
@@ -1774,9 +1829,9 @@
         </w:pict>
       </w:r>
     </w:p>
-    <w:bookmarkEnd w:id="15"/>
-    <w:bookmarkEnd w:id="16"/>
-    <w:bookmarkStart w:id="17" w:name="five-minute-tour"/>
+    <w:bookmarkEnd w:id="18"/>
+    <w:bookmarkEnd w:id="19"/>
+    <w:bookmarkStart w:id="20" w:name="five-minute-tour"/>
     <w:p>
       <w:pPr>
         <w:pStyle w:val="Heading2"/>
@@ -2070,8 +2125,8 @@
         </w:pict>
       </w:r>
     </w:p>
-    <w:bookmarkEnd w:id="17"/>
-    <w:bookmarkStart w:id="19" w:name="language-essentials"/>
+    <w:bookmarkEnd w:id="20"/>
+    <w:bookmarkStart w:id="22" w:name="language-essentials"/>
     <w:p>
       <w:pPr>
         <w:pStyle w:val="Heading2"/>
@@ -2696,7 +2751,7 @@
       <w:r>
         <w:t xml:space="preserve"> </w:t>
       </w:r>
-      <w:hyperlink r:id="rId18">
+      <w:hyperlink r:id="rId21">
         <w:r>
           <w:rPr>
             <w:rStyle w:val="VerbatimChar"/>
@@ -2718,8 +2773,8 @@
         </w:pict>
       </w:r>
     </w:p>
-    <w:bookmarkEnd w:id="19"/>
-    <w:bookmarkStart w:id="20" w:name="cli-reference"/>
+    <w:bookmarkEnd w:id="22"/>
+    <w:bookmarkStart w:id="23" w:name="cli-reference"/>
     <w:p>
       <w:pPr>
         <w:pStyle w:val="Heading2"/>
@@ -3005,8 +3060,8 @@
         </w:pict>
       </w:r>
     </w:p>
-    <w:bookmarkEnd w:id="20"/>
-    <w:bookmarkStart w:id="23" w:name="how-it-works"/>
+    <w:bookmarkEnd w:id="23"/>
+    <w:bookmarkStart w:id="26" w:name="how-it-works"/>
     <w:p>
       <w:pPr>
         <w:pStyle w:val="Heading2"/>
@@ -3247,7 +3302,7 @@
         <w:t xml:space="preserve">cannot run.</w:t>
       </w:r>
     </w:p>
-    <w:bookmarkStart w:id="22" w:name="why-json-in-phase-0"/>
+    <w:bookmarkStart w:id="25" w:name="why-json-in-phase-0"/>
     <w:p>
       <w:pPr>
         <w:pStyle w:val="Heading3"/>
@@ -3304,7 +3359,7 @@
       <w:r>
         <w:t xml:space="preserve"> </w:t>
       </w:r>
-      <w:hyperlink r:id="rId21">
+      <w:hyperlink r:id="rId24">
         <w:r>
           <w:rPr>
             <w:rStyle w:val="VerbatimChar"/>
@@ -3323,9 +3378,9 @@
         </w:pict>
       </w:r>
     </w:p>
-    <w:bookmarkEnd w:id="22"/>
-    <w:bookmarkEnd w:id="23"/>
-    <w:bookmarkStart w:id="24" w:name="hardware-probe-and-install-planner"/>
+    <w:bookmarkEnd w:id="25"/>
+    <w:bookmarkEnd w:id="26"/>
+    <w:bookmarkStart w:id="27" w:name="hardware-probe-and-install-planner"/>
     <w:p>
       <w:pPr>
         <w:pStyle w:val="Heading2"/>
@@ -3613,8 +3668,8 @@
         </w:pict>
       </w:r>
     </w:p>
-    <w:bookmarkEnd w:id="24"/>
-    <w:bookmarkStart w:id="25" w:name="repository-layout"/>
+    <w:bookmarkEnd w:id="27"/>
+    <w:bookmarkStart w:id="28" w:name="repository-layout"/>
     <w:p>
       <w:pPr>
         <w:pStyle w:val="Heading2"/>
@@ -3650,6 +3705,15 @@
           <w:rStyle w:val="VerbatimChar"/>
         </w:rPr>
         <w:t xml:space="preserve">│   └── workflows/ci.yml</w:t>
+      </w:r>
+      <w:r>
+        <w:br/>
+      </w:r>
+      <w:r>
+        <w:rPr>
+          <w:rStyle w:val="VerbatimChar"/>
+        </w:rPr>
+        <w:t xml:space="preserve">├── assets/                   logo, favicon and social preview</w:t>
       </w:r>
       <w:r>
         <w:br/>
@@ -3902,8 +3966,8 @@
         </w:pict>
       </w:r>
     </w:p>
-    <w:bookmarkEnd w:id="25"/>
-    <w:bookmarkStart w:id="30" w:name="documentation"/>
+    <w:bookmarkEnd w:id="28"/>
+    <w:bookmarkStart w:id="34" w:name="documentation"/>
     <w:p>
       <w:pPr>
         <w:pStyle w:val="Heading2"/>
@@ -3957,7 +4021,7 @@
             <w:pPr>
               <w:pStyle w:val="Compact"/>
             </w:pPr>
-            <w:hyperlink r:id="rId26">
+            <w:hyperlink r:id="rId29">
               <w:r>
                 <w:rPr>
                   <w:rStyle w:val="VerbatimChar"/>
@@ -3986,7 +4050,7 @@
             <w:pPr>
               <w:pStyle w:val="Compact"/>
             </w:pPr>
-            <w:hyperlink r:id="rId27">
+            <w:hyperlink r:id="rId30">
               <w:r>
                 <w:rPr>
                   <w:rStyle w:val="VerbatimChar"/>
@@ -4015,7 +4079,7 @@
             <w:pPr>
               <w:pStyle w:val="Compact"/>
             </w:pPr>
-            <w:hyperlink r:id="rId28">
+            <w:hyperlink r:id="rId31">
               <w:r>
                 <w:rPr>
                   <w:rStyle w:val="VerbatimChar"/>
@@ -4044,7 +4108,7 @@
             <w:pPr>
               <w:pStyle w:val="Compact"/>
             </w:pPr>
-            <w:hyperlink r:id="rId29">
+            <w:hyperlink r:id="rId32">
               <w:r>
                 <w:rPr>
                   <w:rStyle w:val="VerbatimChar"/>
@@ -4073,7 +4137,36 @@
             <w:pPr>
               <w:pStyle w:val="Compact"/>
             </w:pPr>
-            <w:hyperlink r:id="rId18">
+            <w:hyperlink r:id="rId33">
+              <w:r>
+                <w:rPr>
+                  <w:rStyle w:val="VerbatimChar"/>
+                </w:rPr>
+                <w:t xml:space="preserve">docs/BRAND.md</w:t>
+              </w:r>
+            </w:hyperlink>
+          </w:p>
+        </w:tc>
+        <w:tc>
+          <w:tcPr/>
+          <w:p>
+            <w:pPr>
+              <w:pStyle w:val="Compact"/>
+            </w:pPr>
+            <w:r>
+              <w:t xml:space="preserve">Logo concept, palette, clear space and usage</w:t>
+            </w:r>
+          </w:p>
+        </w:tc>
+      </w:tr>
+      <w:tr>
+        <w:tc>
+          <w:tcPr/>
+          <w:p>
+            <w:pPr>
+              <w:pStyle w:val="Compact"/>
+            </w:pPr>
+            <w:hyperlink r:id="rId21">
               <w:r>
                 <w:rPr>
                   <w:rStyle w:val="VerbatimChar"/>
@@ -4102,7 +4195,7 @@
             <w:pPr>
               <w:pStyle w:val="Compact"/>
             </w:pPr>
-            <w:hyperlink r:id="rId21">
+            <w:hyperlink r:id="rId24">
               <w:r>
                 <w:rPr>
                   <w:rStyle w:val="VerbatimChar"/>
@@ -4131,7 +4224,7 @@
             <w:pPr>
               <w:pStyle w:val="Compact"/>
             </w:pPr>
-            <w:hyperlink r:id="rId10">
+            <w:hyperlink r:id="rId13">
               <w:r>
                 <w:rPr>
                   <w:rStyle w:val="VerbatimChar"/>
@@ -4226,8 +4319,8 @@
         </w:pict>
       </w:r>
     </w:p>
-    <w:bookmarkEnd w:id="30"/>
-    <w:bookmarkStart w:id="31" w:name="examples"/>
+    <w:bookmarkEnd w:id="34"/>
+    <w:bookmarkStart w:id="35" w:name="examples"/>
     <w:p>
       <w:pPr>
         <w:pStyle w:val="Heading2"/>
@@ -4523,8 +4616,8 @@
         </w:pict>
       </w:r>
     </w:p>
-    <w:bookmarkEnd w:id="31"/>
-    <w:bookmarkStart w:id="32" w:name="testing"/>
+    <w:bookmarkEnd w:id="35"/>
+    <w:bookmarkStart w:id="36" w:name="testing"/>
     <w:p>
       <w:pPr>
         <w:pStyle w:val="Heading2"/>
@@ -4960,8 +5053,8 @@
         </w:pict>
       </w:r>
     </w:p>
-    <w:bookmarkEnd w:id="32"/>
-    <w:bookmarkStart w:id="33" w:name="troubleshooting"/>
+    <w:bookmarkEnd w:id="36"/>
+    <w:bookmarkStart w:id="37" w:name="troubleshooting"/>
     <w:p>
       <w:pPr>
         <w:pStyle w:val="Heading2"/>
@@ -5220,7 +5313,7 @@
             <w:r>
               <w:t xml:space="preserve"> </w:t>
             </w:r>
-            <w:hyperlink r:id="rId27">
+            <w:hyperlink r:id="rId30">
               <w:r>
                 <w:rPr>
                   <w:rStyle w:val="VerbatimChar"/>
@@ -5611,7 +5704,7 @@
       <w:r>
         <w:t xml:space="preserve"> </w:t>
       </w:r>
-      <w:hyperlink r:id="rId29">
+      <w:hyperlink r:id="rId32">
         <w:r>
           <w:rPr>
             <w:rStyle w:val="VerbatimChar"/>
@@ -5630,8 +5723,8 @@
         </w:pict>
       </w:r>
     </w:p>
-    <w:bookmarkEnd w:id="33"/>
-    <w:bookmarkStart w:id="34" w:name="roadmap"/>
+    <w:bookmarkEnd w:id="37"/>
+    <w:bookmarkStart w:id="38" w:name="roadmap"/>
     <w:p>
       <w:pPr>
         <w:pStyle w:val="Heading2"/>
@@ -5863,7 +5956,7 @@
       <w:r>
         <w:t xml:space="preserve"> </w:t>
       </w:r>
-      <w:hyperlink r:id="rId10">
+      <w:hyperlink r:id="rId13">
         <w:r>
           <w:rPr>
             <w:rStyle w:val="VerbatimChar"/>
@@ -5882,8 +5975,8 @@
         </w:pict>
       </w:r>
     </w:p>
-    <w:bookmarkEnd w:id="34"/>
-    <w:bookmarkStart w:id="35" w:name="contributing"/>
+    <w:bookmarkEnd w:id="38"/>
+    <w:bookmarkStart w:id="39" w:name="contributing"/>
     <w:p>
       <w:pPr>
         <w:pStyle w:val="Heading2"/>
@@ -6021,7 +6114,7 @@
       <w:r>
         <w:t xml:space="preserve"> </w:t>
       </w:r>
-      <w:hyperlink r:id="rId28">
+      <w:hyperlink r:id="rId31">
         <w:r>
           <w:rPr>
             <w:rStyle w:val="VerbatimChar"/>
@@ -6040,8 +6133,8 @@
         </w:pict>
       </w:r>
     </w:p>
-    <w:bookmarkEnd w:id="35"/>
-    <w:bookmarkStart w:id="37" w:name="citation"/>
+    <w:bookmarkEnd w:id="39"/>
+    <w:bookmarkStart w:id="41" w:name="citation"/>
     <w:p>
       <w:pPr>
         <w:pStyle w:val="Heading2"/>
@@ -6060,7 +6153,7 @@
       <w:r>
         <w:t xml:space="preserve"> </w:t>
       </w:r>
-      <w:hyperlink r:id="rId36">
+      <w:hyperlink r:id="rId40">
         <w:r>
           <w:rPr>
             <w:rStyle w:val="VerbatimChar"/>
@@ -6153,8 +6246,8 @@
         </w:pict>
       </w:r>
     </w:p>
-    <w:bookmarkEnd w:id="37"/>
-    <w:bookmarkStart w:id="39" w:name="developer"/>
+    <w:bookmarkEnd w:id="41"/>
+    <w:bookmarkStart w:id="43" w:name="developer"/>
     <w:p>
       <w:pPr>
         <w:pStyle w:val="Heading2"/>
@@ -6249,7 +6342,7 @@
       <w:r>
         <w:t xml:space="preserve"> </w:t>
       </w:r>
-      <w:hyperlink r:id="rId38">
+      <w:hyperlink r:id="rId42">
         <w:r>
           <w:rPr>
             <w:rStyle w:val="Hyperlink"/>
@@ -6277,8 +6370,8 @@
         </w:pict>
       </w:r>
     </w:p>
-    <w:bookmarkEnd w:id="39"/>
-    <w:bookmarkStart w:id="40" w:name="naming"/>
+    <w:bookmarkEnd w:id="43"/>
+    <w:bookmarkStart w:id="44" w:name="naming"/>
     <w:p>
       <w:pPr>
         <w:pStyle w:val="Heading2"/>
@@ -6510,8 +6603,8 @@
         </w:pict>
       </w:r>
     </w:p>
-    <w:bookmarkEnd w:id="40"/>
-    <w:bookmarkStart w:id="42" w:name="license"/>
+    <w:bookmarkEnd w:id="44"/>
+    <w:bookmarkStart w:id="46" w:name="license"/>
     <w:p>
       <w:pPr>
         <w:pStyle w:val="Heading2"/>
@@ -6530,7 +6623,7 @@
       <w:r>
         <w:t xml:space="preserve"> </w:t>
       </w:r>
-      <w:hyperlink r:id="rId41">
+      <w:hyperlink r:id="rId45">
         <w:r>
           <w:rPr>
             <w:rStyle w:val="Hyperlink"/>
@@ -6542,8 +6635,8 @@
         <w:t xml:space="preserve">.</w:t>
       </w:r>
     </w:p>
-    <w:bookmarkEnd w:id="42"/>
-    <w:bookmarkEnd w:id="43"/>
+    <w:bookmarkEnd w:id="46"/>
+    <w:bookmarkEnd w:id="47"/>
     <w:sectPr>
       <w:pgSz w:h="15840" w:w="12240"/>
       <w:pgMar w:bottom="1440" w:footer="720" w:gutter="0" w:header="720" w:left="1800" w:right="1800" w:top="1440"/>

</xml_diff>